<commit_message>
feat: improve telegram preliminary appraisal email content and fix tests
</commit_message>
<xml_diff>
--- a/samples/templates/individual/mau_hd.docx
+++ b/samples/templates/individual/mau_hd.docx
@@ -54,43 +54,15 @@
         </w:rPr>
         <w:tab/>
         <w:t>Số: {{SO_HOP_DONG_VAN_BAN}}</w:t>
+      </w:r>
+      <w:r>
+        <w:rPr>
+          <w:b/>
+          <w:sz w:val="22"/>
+          <w:szCs w:val="22"/>
+        </w:rPr>
         <w:tab/>
         <w:t>Độc lập - Tự do - Hạnh phúc</w:t>
-      </w:r>
-      <w:r>
-        <w:rPr>
-          <w:sz w:val="22"/>
-          <w:szCs w:val="22"/>
-        </w:rPr>
-      </w:r>
-      <w:r>
-        <w:rPr>
-          <w:noProof/>
-          <w:color w:val="000000"/>
-          <w:sz w:val="22"/>
-          <w:szCs w:val="22"/>
-        </w:rPr>
-      </w:r>
-      <w:r>
-        <w:rPr>
-          <w:color w:val="000000"/>
-          <w:sz w:val="22"/>
-          <w:szCs w:val="22"/>
-          <w:lang w:val="vi-VN"/>
-        </w:rPr>
-      </w:r>
-      <w:r>
-        <w:rPr>
-          <w:color w:val="000000"/>
-          <w:sz w:val="22"/>
-          <w:szCs w:val="22"/>
-        </w:rPr>
-      </w:r>
-      <w:r>
-        <w:rPr>
-          <w:sz w:val="22"/>
-          <w:szCs w:val="22"/>
-        </w:rPr>
       </w:r>
     </w:p>
     <w:p>
@@ -573,32 +545,6 @@
       <w:r>
         <w:t>Hôm nay,  ngày  {{NGAY}}  tháng {{THANG}}  năm {{NAM}}, chúng tôi gồm có:</w:t>
       </w:r>
-      <w:r>
-        <w:rPr>
-          <w:lang w:val="vi-VN"/>
-        </w:rPr>
-      </w:r>
-      <w:r/>
-      <w:r>
-        <w:rPr>
-          <w:lang w:val="vi-VN"/>
-        </w:rPr>
-      </w:r>
-      <w:r/>
-      <w:r>
-        <w:rPr>
-          <w:noProof/>
-          <w:lang w:val="vi-VN"/>
-        </w:rPr>
-      </w:r>
-      <w:r>
-        <w:rPr>
-          <w:lang w:val="vi-VN"/>
-        </w:rPr>
-      </w:r>
-      <w:r/>
-      <w:r/>
-      <w:r/>
     </w:p>
     <w:p>
       <w:pPr>
@@ -667,19 +613,6 @@
         </w:rPr>
         <w:t>Địa chỉ: {{DIA_CHI_KHACH_HANG}}</w:t>
       </w:r>
-      <w:r>
-        <w:rPr>
-          <w:color w:val="000000"/>
-          <w:lang w:val="vi-VN"/>
-        </w:rPr>
-      </w:r>
-      <w:r>
-        <w:rPr>
-          <w:noProof/>
-          <w:color w:val="000000"/>
-          <w:lang w:val="vi-VN"/>
-        </w:rPr>
-      </w:r>
     </w:p>
     <w:p>
       <w:pPr>
@@ -700,12 +633,6 @@
         </w:rPr>
         <w:t xml:space="preserve">Điện thoại: {{DIEN_THOAI_KHACH_HANG}} </w:t>
       </w:r>
-      <w:r>
-        <w:rPr>
-          <w:noProof/>
-          <w:color w:val="000000"/>
-        </w:rPr>
-      </w:r>
     </w:p>
     <w:p>
       <w:pPr>
@@ -726,12 +653,6 @@
         </w:rPr>
         <w:t>Số CCCD: {{CCCD}}</w:t>
       </w:r>
-      <w:r>
-        <w:rPr>
-          <w:noProof/>
-          <w:color w:val="000000"/>
-        </w:rPr>
-      </w:r>
     </w:p>
     <w:p>
       <w:pPr>
@@ -963,7 +884,7 @@
     </w:p>
     <w:p>
       <w:pPr>
-        <w:pStyle w:val="KhngDncch"/>
+        <w:pStyle w:val="NoSpacing"/>
         <w:spacing w:line="360" w:lineRule="auto"/>
         <w:ind w:firstLine="720"/>
         <w:jc w:val="both"/>
@@ -984,18 +905,10 @@
         </w:rPr>
         <w:t>Tài sản thẩm định giá: {{TAI_SAN_THAM_DINH}}</w:t>
       </w:r>
-      <w:r>
-        <w:rPr>
-          <w:rFonts w:ascii="Times New Roman" w:hAnsi="Times New Roman"/>
-          <w:sz w:val="24"/>
-          <w:szCs w:val="24"/>
-          <w:lang w:val="nl-NL"/>
-        </w:rPr>
-      </w:r>
-    </w:p>
-    <w:p>
-      <w:pPr>
-        <w:pStyle w:val="KhngDncch"/>
+    </w:p>
+    <w:p>
+      <w:pPr>
+        <w:pStyle w:val="NoSpacing"/>
         <w:tabs>
           <w:tab w:val="left" w:pos="720"/>
         </w:tabs>
@@ -1040,7 +953,7 @@
     </w:p>
     <w:p>
       <w:pPr>
-        <w:pStyle w:val="oancuaDanhsach"/>
+        <w:pStyle w:val="ListParagraph"/>
         <w:tabs>
           <w:tab w:val="left" w:pos="567"/>
         </w:tabs>
@@ -1060,38 +973,29 @@
           <w:u w:val="single"/>
           <w:lang w:val="nl-NL"/>
         </w:rPr>
-        <w:t xml:space="preserve">ĐIỀU 2: </w:t>
+        <w:t>ĐIỀU 2:</w:t>
+      </w:r>
+      <w:r>
+        <w:rPr>
+          <w:b/>
+          <w:lang w:val="nl-NL"/>
+        </w:rPr>
+        <w:t xml:space="preserve"> </w:t>
+      </w:r>
+      <w:r>
+        <w:rPr>
+          <w:b/>
+          <w:lang w:val="nl-NL"/>
+        </w:rPr>
         <w:tab/>
-        <w:t>MỤC ĐÍCH THẨM ĐỊNH GIÁ: {{MUC_DICH_THAM_DINH_DAY_DU}}</w:t>
-      </w:r>
-      <w:r>
-        <w:rPr>
-          <w:lang w:val="nl-NL"/>
-        </w:rPr>
-      </w:r>
-      <w:r>
-        <w:rPr>
-          <w:lang w:val="nl-NL"/>
-        </w:rPr>
-      </w:r>
-      <w:r>
-        <w:rPr>
-          <w:b/>
-          <w:lang w:val="nl-NL"/>
-        </w:rPr>
-      </w:r>
-      <w:r>
-        <w:rPr>
-          <w:lang w:val="nl-NL"/>
-        </w:rPr>
+        <w:t xml:space="preserve">MỤC ĐÍCH THẨM ĐỊNH GIÁ: </w:t>
       </w:r>
       <w:r>
         <w:rPr>
           <w:bCs/>
-          <w:noProof/>
-          <w:color w:val="000000"/>
-          <w:lang w:val="nl-NL"/>
-        </w:rPr>
+          <w:lang w:val="nl-NL"/>
+        </w:rPr>
+        <w:t>{{MUC_DICH_THAM_DINH_DAY_DU}}</w:t>
       </w:r>
     </w:p>
     <w:p>
@@ -1109,35 +1013,35 @@
           <w:u w:val="single"/>
           <w:lang w:val="nl-NL"/>
         </w:rPr>
+        <w:t>ĐIỀU 3:</w:t>
+      </w:r>
+      <w:r>
+        <w:rPr>
+          <w:lang w:val="nl-NL"/>
+        </w:rPr>
+        <w:tab/>
+      </w:r>
+      <w:r>
+        <w:rPr>
+          <w:b/>
+          <w:lang w:val="nl-NL"/>
+        </w:rPr>
+        <w:t>THỜI GIAN THỰC HIỆN</w:t>
+      </w:r>
+    </w:p>
+    <w:p>
+      <w:pPr>
+        <w:spacing w:line="360" w:lineRule="auto"/>
+        <w:ind w:firstLine="709"/>
+        <w:rPr>
+          <w:lang w:val="nl-NL"/>
+        </w:rPr>
+      </w:pPr>
+      <w:r>
+        <w:rPr>
+          <w:lang w:val="nl-NL"/>
+        </w:rPr>
         <w:lastRenderedPageBreak/>
-        <w:t>ĐIỀU 3:</w:t>
-      </w:r>
-      <w:r>
-        <w:rPr>
-          <w:lang w:val="nl-NL"/>
-        </w:rPr>
-        <w:tab/>
-      </w:r>
-      <w:r>
-        <w:rPr>
-          <w:b/>
-          <w:lang w:val="nl-NL"/>
-        </w:rPr>
-        <w:t>THỜI GIAN THỰC HIỆN</w:t>
-      </w:r>
-    </w:p>
-    <w:p>
-      <w:pPr>
-        <w:spacing w:line="360" w:lineRule="auto"/>
-        <w:ind w:firstLine="709"/>
-        <w:rPr>
-          <w:lang w:val="nl-NL"/>
-        </w:rPr>
-      </w:pPr>
-      <w:r>
-        <w:rPr>
-          <w:lang w:val="nl-NL"/>
-        </w:rPr>
         <w:t>Thời hạn thực hiện công việc nêu trên là: 05 (Năm) ngày làm việc kể từ ngày Bên A cung cấp đầy đủ thông tin, hồ sơ, tài liệu liên quan đến tài sản được thẩm định giá cho Bên B và bên B hoàn thành việc khảo sát thực tế.</w:t>
       </w:r>
     </w:p>
@@ -1184,21 +1088,6 @@
         </w:rPr>
         <w:t>4.1- Tổng giá dịch vụ (đã bao gồm thuế VAT): {{PHI_THAM_DINH}} VNĐ</w:t>
       </w:r>
-      <w:r>
-        <w:rPr>
-          <w:b/>
-          <w:i/>
-          <w:noProof/>
-          <w:lang w:val="vi-VN"/>
-        </w:rPr>
-      </w:r>
-      <w:r>
-        <w:rPr>
-          <w:b/>
-          <w:i/>
-          <w:lang w:val="nl-NL"/>
-        </w:rPr>
-      </w:r>
     </w:p>
     <w:p>
       <w:pPr>
@@ -1219,13 +1108,43 @@
         </w:rPr>
         <w:t>Bằng chữ: {{PHI_THAM_DINH_BANG_CHU}}</w:t>
       </w:r>
-      <w:r>
-        <w:rPr>
-          <w:bCs/>
+    </w:p>
+    <w:p>
+      <w:pPr>
+        <w:spacing w:line="360" w:lineRule="auto"/>
+        <w:ind w:firstLine="720"/>
+        <w:jc w:val="both"/>
+        <w:rPr>
+          <w:lang w:val="nl-NL"/>
+        </w:rPr>
+      </w:pPr>
+      <w:r>
+        <w:rPr>
+          <w:b/>
           <w:i/>
-          <w:noProof/>
-          <w:lang w:val="nl-NL"/>
-        </w:rPr>
+          <w:lang w:val="nl-NL"/>
+        </w:rPr>
+        <w:t>4.2-</w:t>
+      </w:r>
+      <w:r>
+        <w:rPr>
+          <w:lang w:val="nl-NL"/>
+        </w:rPr>
+        <w:t xml:space="preserve"> </w:t>
+      </w:r>
+      <w:r>
+        <w:rPr>
+          <w:b/>
+          <w:i/>
+          <w:lang w:val="nl-NL"/>
+        </w:rPr>
+        <w:t>Hình thức thanh toán:</w:t>
+      </w:r>
+      <w:r>
+        <w:rPr>
+          <w:lang w:val="nl-NL"/>
+        </w:rPr>
+        <w:t xml:space="preserve"> Thanh toán bằng tiền mặt hoặc chuyển khoản</w:t>
       </w:r>
     </w:p>
     <w:p>
@@ -1233,6 +1152,35 @@
         <w:spacing w:line="360" w:lineRule="auto"/>
         <w:ind w:firstLine="720"/>
         <w:jc w:val="both"/>
+      </w:pPr>
+      <w:r>
+        <w:t>Tên người thụ hưởng:</w:t>
+      </w:r>
+      <w:r>
+        <w:rPr>
+          <w:b/>
+        </w:rPr>
+        <w:t xml:space="preserve"> </w:t>
+      </w:r>
+      <w:r>
+        <w:t>CÔNG TY CỔ PHẦN THẨM ĐỊNH GIÁ THẾ KỶ - CHI NHÁNH TẠI THÀNH PHỐ HỒ CHÍ MINH</w:t>
+      </w:r>
+    </w:p>
+    <w:p>
+      <w:pPr>
+        <w:spacing w:line="360" w:lineRule="auto"/>
+        <w:ind w:firstLine="720"/>
+        <w:jc w:val="both"/>
+      </w:pPr>
+      <w:r>
+        <w:t xml:space="preserve"> Số tài khoản: 0531002471549 mở tại ngân hàng: Ngân hàng Thương mại Cổ phần Ngoại thương Việt Nam – Chi nhánh Đông Sài Gòn.</w:t>
+      </w:r>
+    </w:p>
+    <w:p>
+      <w:pPr>
+        <w:spacing w:line="360" w:lineRule="auto"/>
+        <w:ind w:firstLine="720"/>
+        <w:jc w:val="both"/>
         <w:rPr>
           <w:lang w:val="nl-NL"/>
         </w:rPr>
@@ -1243,73 +1191,6 @@
           <w:i/>
           <w:lang w:val="nl-NL"/>
         </w:rPr>
-        <w:t>4.2-</w:t>
-      </w:r>
-      <w:r>
-        <w:rPr>
-          <w:lang w:val="nl-NL"/>
-        </w:rPr>
-        <w:t xml:space="preserve"> </w:t>
-      </w:r>
-      <w:r>
-        <w:rPr>
-          <w:b/>
-          <w:i/>
-          <w:lang w:val="nl-NL"/>
-        </w:rPr>
-        <w:t>Hình thức thanh toán:</w:t>
-      </w:r>
-      <w:r>
-        <w:rPr>
-          <w:lang w:val="nl-NL"/>
-        </w:rPr>
-        <w:t xml:space="preserve"> Thanh toán bằng tiền mặt hoặc chuyển khoản</w:t>
-      </w:r>
-    </w:p>
-    <w:p>
-      <w:pPr>
-        <w:spacing w:line="360" w:lineRule="auto"/>
-        <w:ind w:firstLine="720"/>
-        <w:jc w:val="both"/>
-      </w:pPr>
-      <w:r>
-        <w:t>Tên người thụ hưởng:</w:t>
-      </w:r>
-      <w:r>
-        <w:rPr>
-          <w:b/>
-        </w:rPr>
-        <w:t xml:space="preserve"> </w:t>
-      </w:r>
-      <w:r>
-        <w:t>CÔNG TY CỔ PHẦN THẨM ĐỊNH GIÁ THẾ KỶ - CHI NHÁNH TẠI THÀNH PHỐ HỒ CHÍ MINH</w:t>
-      </w:r>
-    </w:p>
-    <w:p>
-      <w:pPr>
-        <w:spacing w:line="360" w:lineRule="auto"/>
-        <w:ind w:firstLine="720"/>
-        <w:jc w:val="both"/>
-      </w:pPr>
-      <w:r>
-        <w:t xml:space="preserve"> Số tài khoản: 0531002471549 mở tại ngân hàng: Ngân hàng Thương mại Cổ phần Ngoại thương Việt Nam – Chi nhánh Đông Sài Gòn.</w:t>
-      </w:r>
-    </w:p>
-    <w:p>
-      <w:pPr>
-        <w:spacing w:line="360" w:lineRule="auto"/>
-        <w:ind w:firstLine="720"/>
-        <w:jc w:val="both"/>
-        <w:rPr>
-          <w:lang w:val="nl-NL"/>
-        </w:rPr>
-      </w:pPr>
-      <w:r>
-        <w:rPr>
-          <w:b/>
-          <w:i/>
-          <w:lang w:val="nl-NL"/>
-        </w:rPr>
         <w:t>4.3- Phương thức thanh toán:</w:t>
       </w:r>
       <w:r>
@@ -1332,62 +1213,6 @@
       </w:pPr>
       <w:r>
         <w:t xml:space="preserve">          Bên A thanh toán cho Bên B số tiền : {{PHI_THAM_DINH}} VNĐ (Bằng chữ: {{PHI_THAM_DINH_BANG_CHU}}) ngay sau khi hai bên ký hợp đồng dịch vụ thẩm định giá và trước khi đi khảo sát để đảm bảo triển khai dịch vụ.</w:t>
-      </w:r>
-      <w:r>
-        <w:rPr>
-          <w:lang w:val="fr-FR"/>
-        </w:rPr>
-      </w:r>
-      <w:r>
-        <w:rPr>
-          <w:b/>
-          <w:noProof/>
-          <w:lang w:val="fr-FR"/>
-        </w:rPr>
-      </w:r>
-      <w:r>
-        <w:rPr>
-          <w:b/>
-          <w:lang w:val="fr-FR"/>
-        </w:rPr>
-      </w:r>
-      <w:r>
-        <w:rPr>
-          <w:b/>
-          <w:lang w:val="fr-FR"/>
-        </w:rPr>
-      </w:r>
-      <w:r>
-        <w:rPr>
-          <w:b/>
-          <w:i/>
-          <w:lang w:val="fr-FR"/>
-        </w:rPr>
-      </w:r>
-      <w:r>
-        <w:rPr>
-          <w:b/>
-          <w:i/>
-          <w:noProof/>
-          <w:lang w:val="fr-FR"/>
-        </w:rPr>
-      </w:r>
-      <w:r>
-        <w:rPr>
-          <w:b/>
-          <w:i/>
-          <w:lang w:val="fr-FR"/>
-        </w:rPr>
-      </w:r>
-      <w:r>
-        <w:rPr>
-          <w:lang w:val="fr-FR"/>
-        </w:rPr>
-      </w:r>
-      <w:r>
-        <w:rPr>
-          <w:lang w:val="it-IT"/>
-        </w:rPr>
       </w:r>
     </w:p>
     <w:p>
@@ -1445,12 +1270,6 @@
         </w:rPr>
         <w:t>-    Họ tên:  {{TEN_KHACH_HANG}}</w:t>
       </w:r>
-      <w:r>
-        <w:rPr>
-          <w:noProof/>
-          <w:lang w:val="fr-FR"/>
-        </w:rPr>
-      </w:r>
     </w:p>
     <w:p>
       <w:pPr>
@@ -1467,12 +1286,6 @@
         </w:rPr>
         <w:t>-    Địa chỉ:  {{DIA_CHI_KHACH_HANG}}</w:t>
       </w:r>
-      <w:r>
-        <w:rPr>
-          <w:noProof/>
-          <w:lang w:val="fr-FR"/>
-        </w:rPr>
-      </w:r>
     </w:p>
     <w:p>
       <w:pPr>
@@ -1488,12 +1301,6 @@
           <w:lang w:val="fr-FR"/>
         </w:rPr>
         <w:t xml:space="preserve">-    Điện thoại: {{DIEN_THOAI_KHACH_HANG}}  </w:t>
-      </w:r>
-      <w:r>
-        <w:rPr>
-          <w:noProof/>
-          <w:lang w:val="fr-FR"/>
-        </w:rPr>
       </w:r>
     </w:p>
     <w:p>
@@ -2100,8 +1907,14 @@
         <w:rPr>
           <w:lang w:val="nl-NL"/>
         </w:rPr>
+        <w:t xml:space="preserve">Hai Bên cam kết thực hiện đầy đủ các điều khoản đã ghi trong hợp đồng. Trong quá trình thực hiện nếu có khó khăn vướng mắc phát sinh hai Bên cùng nhau thương lượng giải quyết trên tinh thần </w:t>
+      </w:r>
+      <w:r>
+        <w:rPr>
+          <w:lang w:val="nl-NL"/>
+        </w:rPr>
         <w:lastRenderedPageBreak/>
-        <w:t>Hai Bên cam kết thực hiện đầy đủ các điều khoản đã ghi trong hợp đồng. Trong quá trình thực hiện nếu có khó khăn vướng mắc phát sinh hai Bên cùng nhau thương lượng giải quyết trên tinh thần hợp tác cùng có lợi. Trường hợp hai Bên không tự giải quyết được thì thống nhất chuyển vụ việc đến Trọng tài Kinh tế thuộc Trung tâm Trọng tài Kinh tế Quốc tế Việt Nam (VIAC) tại Tp. Hồ Chí Minh để giải quyết. Khi đó mọi chi phí giải quyết vụ việc sẽ do bên thua chịu trách nhiệm chi trả.</w:t>
+        <w:t>hợp tác cùng có lợi. Trường hợp hai Bên không tự giải quyết được thì thống nhất chuyển vụ việc đến Trọng tài Kinh tế thuộc Trung tâm Trọng tài Kinh tế Quốc tế Việt Nam (VIAC) tại Tp. Hồ Chí Minh để giải quyết. Khi đó mọi chi phí giải quyết vụ việc sẽ do bên thua chịu trách nhiệm chi trả.</w:t>
       </w:r>
       <w:r>
         <w:t xml:space="preserve"> </w:t>
@@ -2489,47 +2302,47 @@
 <w:ftr xmlns:wpc="http://schemas.microsoft.com/office/word/2010/wordprocessingCanvas" xmlns:cx="http://schemas.microsoft.com/office/drawing/2014/chartex" xmlns:cx1="http://schemas.microsoft.com/office/drawing/2015/9/8/chartex" xmlns:cx2="http://schemas.microsoft.com/office/drawing/2015/10/21/chartex" xmlns:cx3="http://schemas.microsoft.com/office/drawing/2016/5/9/chartex" xmlns:cx4="http://schemas.microsoft.com/office/drawing/2016/5/10/chartex" xmlns:cx5="http://schemas.microsoft.com/office/drawing/2016/5/11/chartex" xmlns:cx6="http://schemas.microsoft.com/office/drawing/2016/5/12/chartex" xmlns:cx7="http://schemas.microsoft.com/office/drawing/2016/5/13/chartex" xmlns:cx8="http://schemas.microsoft.com/office/drawing/2016/5/14/chartex" xmlns:mc="http://schemas.openxmlformats.org/markup-compatibility/2006" xmlns:aink="http://schemas.microsoft.com/office/drawing/2016/ink" xmlns:am3d="http://schemas.microsoft.com/office/drawing/2017/model3d" xmlns:o="urn:schemas-microsoft-com:office:office" xmlns:oel="http://schemas.microsoft.com/office/2019/extlst" xmlns:r="http://schemas.openxmlformats.org/officeDocument/2006/relationships" xmlns:m="http://schemas.openxmlformats.org/officeDocument/2006/math" xmlns:v="urn:schemas-microsoft-com:vml" xmlns:wp14="http://schemas.microsoft.com/office/word/2010/wordprocessingDrawing" xmlns:wp="http://schemas.openxmlformats.org/drawingml/2006/wordprocessingDrawing" xmlns:w10="urn:schemas-microsoft-com:office:word" xmlns:w="http://schemas.openxmlformats.org/wordprocessingml/2006/main" xmlns:w14="http://schemas.microsoft.com/office/word/2010/wordml" xmlns:w15="http://schemas.microsoft.com/office/word/2012/wordml" xmlns:w16cex="http://schemas.microsoft.com/office/word/2018/wordml/cex" xmlns:w16cid="http://schemas.microsoft.com/office/word/2016/wordml/cid" xmlns:w16="http://schemas.microsoft.com/office/word/2018/wordml" xmlns:w16du="http://schemas.microsoft.com/office/word/2023/wordml/word16du" xmlns:w16sdtdh="http://schemas.microsoft.com/office/word/2020/wordml/sdtdatahash" xmlns:w16sdtfl="http://schemas.microsoft.com/office/word/2024/wordml/sdtformatlock" xmlns:w16se="http://schemas.microsoft.com/office/word/2015/wordml/symex" xmlns:wpg="http://schemas.microsoft.com/office/word/2010/wordprocessingGroup" xmlns:wpi="http://schemas.microsoft.com/office/word/2010/wordprocessingInk" xmlns:wne="http://schemas.microsoft.com/office/word/2006/wordml" xmlns:wps="http://schemas.microsoft.com/office/word/2010/wordprocessingShape" mc:Ignorable="w14 w15 w16se w16cid w16 w16cex w16sdtdh w16sdtfl w16du wp14">
   <w:p>
     <w:pPr>
-      <w:pStyle w:val="Chntrang"/>
+      <w:pStyle w:val="Footer"/>
       <w:framePr w:wrap="around" w:vAnchor="text" w:hAnchor="margin" w:xAlign="right" w:y="1"/>
       <w:rPr>
-        <w:rStyle w:val="Strang"/>
+        <w:rStyle w:val="PageNumber"/>
       </w:rPr>
     </w:pPr>
     <w:r>
       <w:rPr>
-        <w:rStyle w:val="Strang"/>
+        <w:rStyle w:val="PageNumber"/>
       </w:rPr>
       <w:fldChar w:fldCharType="begin"/>
     </w:r>
     <w:r>
       <w:rPr>
-        <w:rStyle w:val="Strang"/>
+        <w:rStyle w:val="PageNumber"/>
       </w:rPr>
       <w:instrText xml:space="preserve">PAGE  </w:instrText>
     </w:r>
     <w:r>
       <w:rPr>
-        <w:rStyle w:val="Strang"/>
+        <w:rStyle w:val="PageNumber"/>
       </w:rPr>
       <w:fldChar w:fldCharType="separate"/>
     </w:r>
     <w:r>
       <w:rPr>
-        <w:rStyle w:val="Strang"/>
+        <w:rStyle w:val="PageNumber"/>
         <w:noProof/>
       </w:rPr>
       <w:t>1</w:t>
     </w:r>
     <w:r>
       <w:rPr>
-        <w:rStyle w:val="Strang"/>
+        <w:rStyle w:val="PageNumber"/>
       </w:rPr>
       <w:fldChar w:fldCharType="end"/>
     </w:r>
   </w:p>
   <w:p>
     <w:pPr>
-      <w:pStyle w:val="Chntrang"/>
+      <w:pStyle w:val="Footer"/>
       <w:ind w:right="360"/>
     </w:pPr>
   </w:p>
@@ -2540,7 +2353,7 @@
 <w:ftr xmlns:wpc="http://schemas.microsoft.com/office/word/2010/wordprocessingCanvas" xmlns:cx="http://schemas.microsoft.com/office/drawing/2014/chartex" xmlns:cx1="http://schemas.microsoft.com/office/drawing/2015/9/8/chartex" xmlns:cx2="http://schemas.microsoft.com/office/drawing/2015/10/21/chartex" xmlns:cx3="http://schemas.microsoft.com/office/drawing/2016/5/9/chartex" xmlns:cx4="http://schemas.microsoft.com/office/drawing/2016/5/10/chartex" xmlns:cx5="http://schemas.microsoft.com/office/drawing/2016/5/11/chartex" xmlns:cx6="http://schemas.microsoft.com/office/drawing/2016/5/12/chartex" xmlns:cx7="http://schemas.microsoft.com/office/drawing/2016/5/13/chartex" xmlns:cx8="http://schemas.microsoft.com/office/drawing/2016/5/14/chartex" xmlns:mc="http://schemas.openxmlformats.org/markup-compatibility/2006" xmlns:aink="http://schemas.microsoft.com/office/drawing/2016/ink" xmlns:am3d="http://schemas.microsoft.com/office/drawing/2017/model3d" xmlns:o="urn:schemas-microsoft-com:office:office" xmlns:oel="http://schemas.microsoft.com/office/2019/extlst" xmlns:r="http://schemas.openxmlformats.org/officeDocument/2006/relationships" xmlns:m="http://schemas.openxmlformats.org/officeDocument/2006/math" xmlns:v="urn:schemas-microsoft-com:vml" xmlns:wp14="http://schemas.microsoft.com/office/word/2010/wordprocessingDrawing" xmlns:wp="http://schemas.openxmlformats.org/drawingml/2006/wordprocessingDrawing" xmlns:w10="urn:schemas-microsoft-com:office:word" xmlns:w="http://schemas.openxmlformats.org/wordprocessingml/2006/main" xmlns:w14="http://schemas.microsoft.com/office/word/2010/wordml" xmlns:w15="http://schemas.microsoft.com/office/word/2012/wordml" xmlns:w16cex="http://schemas.microsoft.com/office/word/2018/wordml/cex" xmlns:w16cid="http://schemas.microsoft.com/office/word/2016/wordml/cid" xmlns:w16="http://schemas.microsoft.com/office/word/2018/wordml" xmlns:w16du="http://schemas.microsoft.com/office/word/2023/wordml/word16du" xmlns:w16sdtdh="http://schemas.microsoft.com/office/word/2020/wordml/sdtdatahash" xmlns:w16sdtfl="http://schemas.microsoft.com/office/word/2024/wordml/sdtformatlock" xmlns:w16se="http://schemas.microsoft.com/office/word/2015/wordml/symex" xmlns:wpg="http://schemas.microsoft.com/office/word/2010/wordprocessingGroup" xmlns:wpi="http://schemas.microsoft.com/office/word/2010/wordprocessingInk" xmlns:wne="http://schemas.microsoft.com/office/word/2006/wordml" xmlns:wps="http://schemas.microsoft.com/office/word/2010/wordprocessingShape" mc:Ignorable="w14 w15 w16se w16cid w16 w16cex w16sdtdh w16sdtfl w16du wp14">
   <w:p>
     <w:pPr>
-      <w:pStyle w:val="Chntrang"/>
+      <w:pStyle w:val="Footer"/>
       <w:jc w:val="center"/>
       <w:rPr>
         <w:sz w:val="20"/>
@@ -2656,7 +2469,7 @@
   </w:p>
   <w:p>
     <w:pPr>
-      <w:pStyle w:val="Chntrang"/>
+      <w:pStyle w:val="Footer"/>
       <w:ind w:right="360"/>
       <w:jc w:val="right"/>
       <w:rPr>
@@ -2673,7 +2486,7 @@
 <w:ftr xmlns:wpc="http://schemas.microsoft.com/office/word/2010/wordprocessingCanvas" xmlns:cx="http://schemas.microsoft.com/office/drawing/2014/chartex" xmlns:cx1="http://schemas.microsoft.com/office/drawing/2015/9/8/chartex" xmlns:cx2="http://schemas.microsoft.com/office/drawing/2015/10/21/chartex" xmlns:cx3="http://schemas.microsoft.com/office/drawing/2016/5/9/chartex" xmlns:cx4="http://schemas.microsoft.com/office/drawing/2016/5/10/chartex" xmlns:cx5="http://schemas.microsoft.com/office/drawing/2016/5/11/chartex" xmlns:cx6="http://schemas.microsoft.com/office/drawing/2016/5/12/chartex" xmlns:cx7="http://schemas.microsoft.com/office/drawing/2016/5/13/chartex" xmlns:cx8="http://schemas.microsoft.com/office/drawing/2016/5/14/chartex" xmlns:mc="http://schemas.openxmlformats.org/markup-compatibility/2006" xmlns:aink="http://schemas.microsoft.com/office/drawing/2016/ink" xmlns:am3d="http://schemas.microsoft.com/office/drawing/2017/model3d" xmlns:o="urn:schemas-microsoft-com:office:office" xmlns:oel="http://schemas.microsoft.com/office/2019/extlst" xmlns:r="http://schemas.openxmlformats.org/officeDocument/2006/relationships" xmlns:m="http://schemas.openxmlformats.org/officeDocument/2006/math" xmlns:v="urn:schemas-microsoft-com:vml" xmlns:wp14="http://schemas.microsoft.com/office/word/2010/wordprocessingDrawing" xmlns:wp="http://schemas.openxmlformats.org/drawingml/2006/wordprocessingDrawing" xmlns:w10="urn:schemas-microsoft-com:office:word" xmlns:w="http://schemas.openxmlformats.org/wordprocessingml/2006/main" xmlns:w14="http://schemas.microsoft.com/office/word/2010/wordml" xmlns:w15="http://schemas.microsoft.com/office/word/2012/wordml" xmlns:w16cex="http://schemas.microsoft.com/office/word/2018/wordml/cex" xmlns:w16cid="http://schemas.microsoft.com/office/word/2016/wordml/cid" xmlns:w16="http://schemas.microsoft.com/office/word/2018/wordml" xmlns:w16du="http://schemas.microsoft.com/office/word/2023/wordml/word16du" xmlns:w16sdtdh="http://schemas.microsoft.com/office/word/2020/wordml/sdtdatahash" xmlns:w16sdtfl="http://schemas.microsoft.com/office/word/2024/wordml/sdtformatlock" xmlns:w16se="http://schemas.microsoft.com/office/word/2015/wordml/symex" xmlns:wpg="http://schemas.microsoft.com/office/word/2010/wordprocessingGroup" xmlns:wpi="http://schemas.microsoft.com/office/word/2010/wordprocessingInk" xmlns:wne="http://schemas.microsoft.com/office/word/2006/wordml" xmlns:wps="http://schemas.microsoft.com/office/word/2010/wordprocessingShape" mc:Ignorable="w14 w15 w16se w16cid w16 w16cex w16sdtdh w16sdtfl w16du wp14">
   <w:p>
     <w:pPr>
-      <w:pStyle w:val="Chntrang"/>
+      <w:pStyle w:val="Footer"/>
     </w:pPr>
   </w:p>
 </w:ftr>
@@ -2683,47 +2496,47 @@
 <w:ftr xmlns:wpc="http://schemas.microsoft.com/office/word/2010/wordprocessingCanvas" xmlns:cx="http://schemas.microsoft.com/office/drawing/2014/chartex" xmlns:cx1="http://schemas.microsoft.com/office/drawing/2015/9/8/chartex" xmlns:cx2="http://schemas.microsoft.com/office/drawing/2015/10/21/chartex" xmlns:cx3="http://schemas.microsoft.com/office/drawing/2016/5/9/chartex" xmlns:cx4="http://schemas.microsoft.com/office/drawing/2016/5/10/chartex" xmlns:cx5="http://schemas.microsoft.com/office/drawing/2016/5/11/chartex" xmlns:cx6="http://schemas.microsoft.com/office/drawing/2016/5/12/chartex" xmlns:cx7="http://schemas.microsoft.com/office/drawing/2016/5/13/chartex" xmlns:cx8="http://schemas.microsoft.com/office/drawing/2016/5/14/chartex" xmlns:mc="http://schemas.openxmlformats.org/markup-compatibility/2006" xmlns:aink="http://schemas.microsoft.com/office/drawing/2016/ink" xmlns:am3d="http://schemas.microsoft.com/office/drawing/2017/model3d" xmlns:o="urn:schemas-microsoft-com:office:office" xmlns:oel="http://schemas.microsoft.com/office/2019/extlst" xmlns:r="http://schemas.openxmlformats.org/officeDocument/2006/relationships" xmlns:m="http://schemas.openxmlformats.org/officeDocument/2006/math" xmlns:v="urn:schemas-microsoft-com:vml" xmlns:wp14="http://schemas.microsoft.com/office/word/2010/wordprocessingDrawing" xmlns:wp="http://schemas.openxmlformats.org/drawingml/2006/wordprocessingDrawing" xmlns:w10="urn:schemas-microsoft-com:office:word" xmlns:w="http://schemas.openxmlformats.org/wordprocessingml/2006/main" xmlns:w14="http://schemas.microsoft.com/office/word/2010/wordml" xmlns:w15="http://schemas.microsoft.com/office/word/2012/wordml" xmlns:w16cex="http://schemas.microsoft.com/office/word/2018/wordml/cex" xmlns:w16cid="http://schemas.microsoft.com/office/word/2016/wordml/cid" xmlns:w16="http://schemas.microsoft.com/office/word/2018/wordml" xmlns:w16du="http://schemas.microsoft.com/office/word/2023/wordml/word16du" xmlns:w16sdtdh="http://schemas.microsoft.com/office/word/2020/wordml/sdtdatahash" xmlns:w16sdtfl="http://schemas.microsoft.com/office/word/2024/wordml/sdtformatlock" xmlns:w16se="http://schemas.microsoft.com/office/word/2015/wordml/symex" xmlns:wpg="http://schemas.microsoft.com/office/word/2010/wordprocessingGroup" xmlns:wpi="http://schemas.microsoft.com/office/word/2010/wordprocessingInk" xmlns:wne="http://schemas.microsoft.com/office/word/2006/wordml" xmlns:wps="http://schemas.microsoft.com/office/word/2010/wordprocessingShape" mc:Ignorable="w14 w15 w16se w16cid w16 w16cex w16sdtdh w16sdtfl w16du wp14">
   <w:p>
     <w:pPr>
-      <w:pStyle w:val="Chntrang"/>
+      <w:pStyle w:val="Footer"/>
       <w:framePr w:wrap="around" w:vAnchor="text" w:hAnchor="margin" w:xAlign="right" w:y="1"/>
       <w:rPr>
-        <w:rStyle w:val="Strang"/>
+        <w:rStyle w:val="PageNumber"/>
       </w:rPr>
     </w:pPr>
     <w:r>
       <w:rPr>
-        <w:rStyle w:val="Strang"/>
+        <w:rStyle w:val="PageNumber"/>
       </w:rPr>
       <w:fldChar w:fldCharType="begin"/>
     </w:r>
     <w:r>
       <w:rPr>
-        <w:rStyle w:val="Strang"/>
+        <w:rStyle w:val="PageNumber"/>
       </w:rPr>
       <w:instrText xml:space="preserve">PAGE  </w:instrText>
     </w:r>
     <w:r>
       <w:rPr>
-        <w:rStyle w:val="Strang"/>
+        <w:rStyle w:val="PageNumber"/>
       </w:rPr>
       <w:fldChar w:fldCharType="separate"/>
     </w:r>
     <w:r>
       <w:rPr>
-        <w:rStyle w:val="Strang"/>
+        <w:rStyle w:val="PageNumber"/>
         <w:noProof/>
       </w:rPr>
       <w:t>1</w:t>
     </w:r>
     <w:r>
       <w:rPr>
-        <w:rStyle w:val="Strang"/>
+        <w:rStyle w:val="PageNumber"/>
       </w:rPr>
       <w:fldChar w:fldCharType="end"/>
     </w:r>
   </w:p>
   <w:p>
     <w:pPr>
-      <w:pStyle w:val="Chntrang"/>
+      <w:pStyle w:val="Footer"/>
       <w:ind w:right="360"/>
     </w:pPr>
   </w:p>
@@ -2734,7 +2547,7 @@
 <w:ftr xmlns:wpc="http://schemas.microsoft.com/office/word/2010/wordprocessingCanvas" xmlns:cx="http://schemas.microsoft.com/office/drawing/2014/chartex" xmlns:cx1="http://schemas.microsoft.com/office/drawing/2015/9/8/chartex" xmlns:cx2="http://schemas.microsoft.com/office/drawing/2015/10/21/chartex" xmlns:cx3="http://schemas.microsoft.com/office/drawing/2016/5/9/chartex" xmlns:cx4="http://schemas.microsoft.com/office/drawing/2016/5/10/chartex" xmlns:cx5="http://schemas.microsoft.com/office/drawing/2016/5/11/chartex" xmlns:cx6="http://schemas.microsoft.com/office/drawing/2016/5/12/chartex" xmlns:cx7="http://schemas.microsoft.com/office/drawing/2016/5/13/chartex" xmlns:cx8="http://schemas.microsoft.com/office/drawing/2016/5/14/chartex" xmlns:mc="http://schemas.openxmlformats.org/markup-compatibility/2006" xmlns:aink="http://schemas.microsoft.com/office/drawing/2016/ink" xmlns:am3d="http://schemas.microsoft.com/office/drawing/2017/model3d" xmlns:o="urn:schemas-microsoft-com:office:office" xmlns:oel="http://schemas.microsoft.com/office/2019/extlst" xmlns:r="http://schemas.openxmlformats.org/officeDocument/2006/relationships" xmlns:m="http://schemas.openxmlformats.org/officeDocument/2006/math" xmlns:v="urn:schemas-microsoft-com:vml" xmlns:wp14="http://schemas.microsoft.com/office/word/2010/wordprocessingDrawing" xmlns:wp="http://schemas.openxmlformats.org/drawingml/2006/wordprocessingDrawing" xmlns:w10="urn:schemas-microsoft-com:office:word" xmlns:w="http://schemas.openxmlformats.org/wordprocessingml/2006/main" xmlns:w14="http://schemas.microsoft.com/office/word/2010/wordml" xmlns:w15="http://schemas.microsoft.com/office/word/2012/wordml" xmlns:w16cex="http://schemas.microsoft.com/office/word/2018/wordml/cex" xmlns:w16cid="http://schemas.microsoft.com/office/word/2016/wordml/cid" xmlns:w16="http://schemas.microsoft.com/office/word/2018/wordml" xmlns:w16du="http://schemas.microsoft.com/office/word/2023/wordml/word16du" xmlns:w16sdtdh="http://schemas.microsoft.com/office/word/2020/wordml/sdtdatahash" xmlns:w16sdtfl="http://schemas.microsoft.com/office/word/2024/wordml/sdtformatlock" xmlns:w16se="http://schemas.microsoft.com/office/word/2015/wordml/symex" xmlns:wpg="http://schemas.microsoft.com/office/word/2010/wordprocessingGroup" xmlns:wpi="http://schemas.microsoft.com/office/word/2010/wordprocessingInk" xmlns:wne="http://schemas.microsoft.com/office/word/2006/wordml" xmlns:wps="http://schemas.microsoft.com/office/word/2010/wordprocessingShape" mc:Ignorable="w14 w15 w16se w16cid w16 w16cex w16sdtdh w16sdtfl w16du wp14">
   <w:p>
     <w:pPr>
-      <w:pStyle w:val="Chntrang"/>
+      <w:pStyle w:val="Footer"/>
       <w:jc w:val="center"/>
       <w:rPr>
         <w:sz w:val="20"/>
@@ -2850,7 +2663,7 @@
   </w:p>
   <w:p>
     <w:pPr>
-      <w:pStyle w:val="Chntrang"/>
+      <w:pStyle w:val="Footer"/>
       <w:ind w:right="360"/>
       <w:jc w:val="right"/>
       <w:rPr>
@@ -2867,7 +2680,7 @@
 <w:ftr xmlns:wpc="http://schemas.microsoft.com/office/word/2010/wordprocessingCanvas" xmlns:cx="http://schemas.microsoft.com/office/drawing/2014/chartex" xmlns:cx1="http://schemas.microsoft.com/office/drawing/2015/9/8/chartex" xmlns:cx2="http://schemas.microsoft.com/office/drawing/2015/10/21/chartex" xmlns:cx3="http://schemas.microsoft.com/office/drawing/2016/5/9/chartex" xmlns:cx4="http://schemas.microsoft.com/office/drawing/2016/5/10/chartex" xmlns:cx5="http://schemas.microsoft.com/office/drawing/2016/5/11/chartex" xmlns:cx6="http://schemas.microsoft.com/office/drawing/2016/5/12/chartex" xmlns:cx7="http://schemas.microsoft.com/office/drawing/2016/5/13/chartex" xmlns:cx8="http://schemas.microsoft.com/office/drawing/2016/5/14/chartex" xmlns:mc="http://schemas.openxmlformats.org/markup-compatibility/2006" xmlns:aink="http://schemas.microsoft.com/office/drawing/2016/ink" xmlns:am3d="http://schemas.microsoft.com/office/drawing/2017/model3d" xmlns:o="urn:schemas-microsoft-com:office:office" xmlns:oel="http://schemas.microsoft.com/office/2019/extlst" xmlns:r="http://schemas.openxmlformats.org/officeDocument/2006/relationships" xmlns:m="http://schemas.openxmlformats.org/officeDocument/2006/math" xmlns:v="urn:schemas-microsoft-com:vml" xmlns:wp14="http://schemas.microsoft.com/office/word/2010/wordprocessingDrawing" xmlns:wp="http://schemas.openxmlformats.org/drawingml/2006/wordprocessingDrawing" xmlns:w10="urn:schemas-microsoft-com:office:word" xmlns:w="http://schemas.openxmlformats.org/wordprocessingml/2006/main" xmlns:w14="http://schemas.microsoft.com/office/word/2010/wordml" xmlns:w15="http://schemas.microsoft.com/office/word/2012/wordml" xmlns:w16cex="http://schemas.microsoft.com/office/word/2018/wordml/cex" xmlns:w16cid="http://schemas.microsoft.com/office/word/2016/wordml/cid" xmlns:w16="http://schemas.microsoft.com/office/word/2018/wordml" xmlns:w16du="http://schemas.microsoft.com/office/word/2023/wordml/word16du" xmlns:w16sdtdh="http://schemas.microsoft.com/office/word/2020/wordml/sdtdatahash" xmlns:w16sdtfl="http://schemas.microsoft.com/office/word/2024/wordml/sdtformatlock" xmlns:w16se="http://schemas.microsoft.com/office/word/2015/wordml/symex" xmlns:wpg="http://schemas.microsoft.com/office/word/2010/wordprocessingGroup" xmlns:wpi="http://schemas.microsoft.com/office/word/2010/wordprocessingInk" xmlns:wne="http://schemas.microsoft.com/office/word/2006/wordml" xmlns:wps="http://schemas.microsoft.com/office/word/2010/wordprocessingShape" mc:Ignorable="w14 w15 w16se w16cid w16 w16cex w16sdtdh w16sdtfl w16du wp14">
   <w:p>
     <w:pPr>
-      <w:pStyle w:val="Chntrang"/>
+      <w:pStyle w:val="Footer"/>
     </w:pPr>
   </w:p>
 </w:ftr>
@@ -2896,7 +2709,7 @@
 <w:hdr xmlns:wpc="http://schemas.microsoft.com/office/word/2010/wordprocessingCanvas" xmlns:cx="http://schemas.microsoft.com/office/drawing/2014/chartex" xmlns:cx1="http://schemas.microsoft.com/office/drawing/2015/9/8/chartex" xmlns:cx2="http://schemas.microsoft.com/office/drawing/2015/10/21/chartex" xmlns:cx3="http://schemas.microsoft.com/office/drawing/2016/5/9/chartex" xmlns:cx4="http://schemas.microsoft.com/office/drawing/2016/5/10/chartex" xmlns:cx5="http://schemas.microsoft.com/office/drawing/2016/5/11/chartex" xmlns:cx6="http://schemas.microsoft.com/office/drawing/2016/5/12/chartex" xmlns:cx7="http://schemas.microsoft.com/office/drawing/2016/5/13/chartex" xmlns:cx8="http://schemas.microsoft.com/office/drawing/2016/5/14/chartex" xmlns:mc="http://schemas.openxmlformats.org/markup-compatibility/2006" xmlns:aink="http://schemas.microsoft.com/office/drawing/2016/ink" xmlns:am3d="http://schemas.microsoft.com/office/drawing/2017/model3d" xmlns:o="urn:schemas-microsoft-com:office:office" xmlns:oel="http://schemas.microsoft.com/office/2019/extlst" xmlns:r="http://schemas.openxmlformats.org/officeDocument/2006/relationships" xmlns:m="http://schemas.openxmlformats.org/officeDocument/2006/math" xmlns:v="urn:schemas-microsoft-com:vml" xmlns:wp14="http://schemas.microsoft.com/office/word/2010/wordprocessingDrawing" xmlns:wp="http://schemas.openxmlformats.org/drawingml/2006/wordprocessingDrawing" xmlns:w10="urn:schemas-microsoft-com:office:word" xmlns:w="http://schemas.openxmlformats.org/wordprocessingml/2006/main" xmlns:w14="http://schemas.microsoft.com/office/word/2010/wordml" xmlns:w15="http://schemas.microsoft.com/office/word/2012/wordml" xmlns:w16cex="http://schemas.microsoft.com/office/word/2018/wordml/cex" xmlns:w16cid="http://schemas.microsoft.com/office/word/2016/wordml/cid" xmlns:w16="http://schemas.microsoft.com/office/word/2018/wordml" xmlns:w16du="http://schemas.microsoft.com/office/word/2023/wordml/word16du" xmlns:w16sdtdh="http://schemas.microsoft.com/office/word/2020/wordml/sdtdatahash" xmlns:w16sdtfl="http://schemas.microsoft.com/office/word/2024/wordml/sdtformatlock" xmlns:w16se="http://schemas.microsoft.com/office/word/2015/wordml/symex" xmlns:wpg="http://schemas.microsoft.com/office/word/2010/wordprocessingGroup" xmlns:wpi="http://schemas.microsoft.com/office/word/2010/wordprocessingInk" xmlns:wne="http://schemas.microsoft.com/office/word/2006/wordml" xmlns:wps="http://schemas.microsoft.com/office/word/2010/wordprocessingShape" mc:Ignorable="w14 w15 w16se w16cid w16 w16cex w16sdtdh w16sdtfl w16du wp14">
   <w:p>
     <w:pPr>
-      <w:pStyle w:val="utrang"/>
+      <w:pStyle w:val="Header"/>
     </w:pPr>
   </w:p>
 </w:hdr>
@@ -2906,7 +2719,7 @@
 <w:hdr xmlns:wpc="http://schemas.microsoft.com/office/word/2010/wordprocessingCanvas" xmlns:cx="http://schemas.microsoft.com/office/drawing/2014/chartex" xmlns:cx1="http://schemas.microsoft.com/office/drawing/2015/9/8/chartex" xmlns:cx2="http://schemas.microsoft.com/office/drawing/2015/10/21/chartex" xmlns:cx3="http://schemas.microsoft.com/office/drawing/2016/5/9/chartex" xmlns:cx4="http://schemas.microsoft.com/office/drawing/2016/5/10/chartex" xmlns:cx5="http://schemas.microsoft.com/office/drawing/2016/5/11/chartex" xmlns:cx6="http://schemas.microsoft.com/office/drawing/2016/5/12/chartex" xmlns:cx7="http://schemas.microsoft.com/office/drawing/2016/5/13/chartex" xmlns:cx8="http://schemas.microsoft.com/office/drawing/2016/5/14/chartex" xmlns:mc="http://schemas.openxmlformats.org/markup-compatibility/2006" xmlns:aink="http://schemas.microsoft.com/office/drawing/2016/ink" xmlns:am3d="http://schemas.microsoft.com/office/drawing/2017/model3d" xmlns:o="urn:schemas-microsoft-com:office:office" xmlns:oel="http://schemas.microsoft.com/office/2019/extlst" xmlns:r="http://schemas.openxmlformats.org/officeDocument/2006/relationships" xmlns:m="http://schemas.openxmlformats.org/officeDocument/2006/math" xmlns:v="urn:schemas-microsoft-com:vml" xmlns:wp14="http://schemas.microsoft.com/office/word/2010/wordprocessingDrawing" xmlns:wp="http://schemas.openxmlformats.org/drawingml/2006/wordprocessingDrawing" xmlns:w10="urn:schemas-microsoft-com:office:word" xmlns:w="http://schemas.openxmlformats.org/wordprocessingml/2006/main" xmlns:w14="http://schemas.microsoft.com/office/word/2010/wordml" xmlns:w15="http://schemas.microsoft.com/office/word/2012/wordml" xmlns:w16cex="http://schemas.microsoft.com/office/word/2018/wordml/cex" xmlns:w16cid="http://schemas.microsoft.com/office/word/2016/wordml/cid" xmlns:w16="http://schemas.microsoft.com/office/word/2018/wordml" xmlns:w16du="http://schemas.microsoft.com/office/word/2023/wordml/word16du" xmlns:w16sdtdh="http://schemas.microsoft.com/office/word/2020/wordml/sdtdatahash" xmlns:w16sdtfl="http://schemas.microsoft.com/office/word/2024/wordml/sdtformatlock" xmlns:w16se="http://schemas.microsoft.com/office/word/2015/wordml/symex" xmlns:wpg="http://schemas.microsoft.com/office/word/2010/wordprocessingGroup" xmlns:wpi="http://schemas.microsoft.com/office/word/2010/wordprocessingInk" xmlns:wne="http://schemas.microsoft.com/office/word/2006/wordml" xmlns:wps="http://schemas.microsoft.com/office/word/2010/wordprocessingShape" mc:Ignorable="w14 w15 w16se w16cid w16 w16cex w16sdtdh w16sdtfl w16du wp14">
   <w:p>
     <w:pPr>
-      <w:pStyle w:val="utrang"/>
+      <w:pStyle w:val="Header"/>
     </w:pPr>
   </w:p>
 </w:hdr>
@@ -2916,7 +2729,7 @@
 <w:hdr xmlns:wpc="http://schemas.microsoft.com/office/word/2010/wordprocessingCanvas" xmlns:cx="http://schemas.microsoft.com/office/drawing/2014/chartex" xmlns:cx1="http://schemas.microsoft.com/office/drawing/2015/9/8/chartex" xmlns:cx2="http://schemas.microsoft.com/office/drawing/2015/10/21/chartex" xmlns:cx3="http://schemas.microsoft.com/office/drawing/2016/5/9/chartex" xmlns:cx4="http://schemas.microsoft.com/office/drawing/2016/5/10/chartex" xmlns:cx5="http://schemas.microsoft.com/office/drawing/2016/5/11/chartex" xmlns:cx6="http://schemas.microsoft.com/office/drawing/2016/5/12/chartex" xmlns:cx7="http://schemas.microsoft.com/office/drawing/2016/5/13/chartex" xmlns:cx8="http://schemas.microsoft.com/office/drawing/2016/5/14/chartex" xmlns:mc="http://schemas.openxmlformats.org/markup-compatibility/2006" xmlns:aink="http://schemas.microsoft.com/office/drawing/2016/ink" xmlns:am3d="http://schemas.microsoft.com/office/drawing/2017/model3d" xmlns:o="urn:schemas-microsoft-com:office:office" xmlns:oel="http://schemas.microsoft.com/office/2019/extlst" xmlns:r="http://schemas.openxmlformats.org/officeDocument/2006/relationships" xmlns:m="http://schemas.openxmlformats.org/officeDocument/2006/math" xmlns:v="urn:schemas-microsoft-com:vml" xmlns:wp14="http://schemas.microsoft.com/office/word/2010/wordprocessingDrawing" xmlns:wp="http://schemas.openxmlformats.org/drawingml/2006/wordprocessingDrawing" xmlns:w10="urn:schemas-microsoft-com:office:word" xmlns:w="http://schemas.openxmlformats.org/wordprocessingml/2006/main" xmlns:w14="http://schemas.microsoft.com/office/word/2010/wordml" xmlns:w15="http://schemas.microsoft.com/office/word/2012/wordml" xmlns:w16cex="http://schemas.microsoft.com/office/word/2018/wordml/cex" xmlns:w16cid="http://schemas.microsoft.com/office/word/2016/wordml/cid" xmlns:w16="http://schemas.microsoft.com/office/word/2018/wordml" xmlns:w16du="http://schemas.microsoft.com/office/word/2023/wordml/word16du" xmlns:w16sdtdh="http://schemas.microsoft.com/office/word/2020/wordml/sdtdatahash" xmlns:w16sdtfl="http://schemas.microsoft.com/office/word/2024/wordml/sdtformatlock" xmlns:w16se="http://schemas.microsoft.com/office/word/2015/wordml/symex" xmlns:wpg="http://schemas.microsoft.com/office/word/2010/wordprocessingGroup" xmlns:wpi="http://schemas.microsoft.com/office/word/2010/wordprocessingInk" xmlns:wne="http://schemas.microsoft.com/office/word/2006/wordml" xmlns:wps="http://schemas.microsoft.com/office/word/2010/wordprocessingShape" mc:Ignorable="w14 w15 w16se w16cid w16 w16cex w16sdtdh w16sdtfl w16du wp14">
   <w:p>
     <w:pPr>
-      <w:pStyle w:val="utrang"/>
+      <w:pStyle w:val="Header"/>
     </w:pPr>
   </w:p>
 </w:hdr>
@@ -2926,7 +2739,7 @@
 <w:hdr xmlns:wpc="http://schemas.microsoft.com/office/word/2010/wordprocessingCanvas" xmlns:cx="http://schemas.microsoft.com/office/drawing/2014/chartex" xmlns:cx1="http://schemas.microsoft.com/office/drawing/2015/9/8/chartex" xmlns:cx2="http://schemas.microsoft.com/office/drawing/2015/10/21/chartex" xmlns:cx3="http://schemas.microsoft.com/office/drawing/2016/5/9/chartex" xmlns:cx4="http://schemas.microsoft.com/office/drawing/2016/5/10/chartex" xmlns:cx5="http://schemas.microsoft.com/office/drawing/2016/5/11/chartex" xmlns:cx6="http://schemas.microsoft.com/office/drawing/2016/5/12/chartex" xmlns:cx7="http://schemas.microsoft.com/office/drawing/2016/5/13/chartex" xmlns:cx8="http://schemas.microsoft.com/office/drawing/2016/5/14/chartex" xmlns:mc="http://schemas.openxmlformats.org/markup-compatibility/2006" xmlns:aink="http://schemas.microsoft.com/office/drawing/2016/ink" xmlns:am3d="http://schemas.microsoft.com/office/drawing/2017/model3d" xmlns:o="urn:schemas-microsoft-com:office:office" xmlns:oel="http://schemas.microsoft.com/office/2019/extlst" xmlns:r="http://schemas.openxmlformats.org/officeDocument/2006/relationships" xmlns:m="http://schemas.openxmlformats.org/officeDocument/2006/math" xmlns:v="urn:schemas-microsoft-com:vml" xmlns:wp14="http://schemas.microsoft.com/office/word/2010/wordprocessingDrawing" xmlns:wp="http://schemas.openxmlformats.org/drawingml/2006/wordprocessingDrawing" xmlns:w10="urn:schemas-microsoft-com:office:word" xmlns:w="http://schemas.openxmlformats.org/wordprocessingml/2006/main" xmlns:w14="http://schemas.microsoft.com/office/word/2010/wordml" xmlns:w15="http://schemas.microsoft.com/office/word/2012/wordml" xmlns:w16cex="http://schemas.microsoft.com/office/word/2018/wordml/cex" xmlns:w16cid="http://schemas.microsoft.com/office/word/2016/wordml/cid" xmlns:w16="http://schemas.microsoft.com/office/word/2018/wordml" xmlns:w16du="http://schemas.microsoft.com/office/word/2023/wordml/word16du" xmlns:w16sdtdh="http://schemas.microsoft.com/office/word/2020/wordml/sdtdatahash" xmlns:w16sdtfl="http://schemas.microsoft.com/office/word/2024/wordml/sdtformatlock" xmlns:w16se="http://schemas.microsoft.com/office/word/2015/wordml/symex" xmlns:wpg="http://schemas.microsoft.com/office/word/2010/wordprocessingGroup" xmlns:wpi="http://schemas.microsoft.com/office/word/2010/wordprocessingInk" xmlns:wne="http://schemas.microsoft.com/office/word/2006/wordml" xmlns:wps="http://schemas.microsoft.com/office/word/2010/wordprocessingShape" mc:Ignorable="w14 w15 w16se w16cid w16 w16cex w16sdtdh w16sdtfl w16du wp14">
   <w:p>
     <w:pPr>
-      <w:pStyle w:val="utrang"/>
+      <w:pStyle w:val="Header"/>
     </w:pPr>
   </w:p>
 </w:hdr>
@@ -2936,7 +2749,7 @@
 <w:hdr xmlns:wpc="http://schemas.microsoft.com/office/word/2010/wordprocessingCanvas" xmlns:cx="http://schemas.microsoft.com/office/drawing/2014/chartex" xmlns:cx1="http://schemas.microsoft.com/office/drawing/2015/9/8/chartex" xmlns:cx2="http://schemas.microsoft.com/office/drawing/2015/10/21/chartex" xmlns:cx3="http://schemas.microsoft.com/office/drawing/2016/5/9/chartex" xmlns:cx4="http://schemas.microsoft.com/office/drawing/2016/5/10/chartex" xmlns:cx5="http://schemas.microsoft.com/office/drawing/2016/5/11/chartex" xmlns:cx6="http://schemas.microsoft.com/office/drawing/2016/5/12/chartex" xmlns:cx7="http://schemas.microsoft.com/office/drawing/2016/5/13/chartex" xmlns:cx8="http://schemas.microsoft.com/office/drawing/2016/5/14/chartex" xmlns:mc="http://schemas.openxmlformats.org/markup-compatibility/2006" xmlns:aink="http://schemas.microsoft.com/office/drawing/2016/ink" xmlns:am3d="http://schemas.microsoft.com/office/drawing/2017/model3d" xmlns:o="urn:schemas-microsoft-com:office:office" xmlns:oel="http://schemas.microsoft.com/office/2019/extlst" xmlns:r="http://schemas.openxmlformats.org/officeDocument/2006/relationships" xmlns:m="http://schemas.openxmlformats.org/officeDocument/2006/math" xmlns:v="urn:schemas-microsoft-com:vml" xmlns:wp14="http://schemas.microsoft.com/office/word/2010/wordprocessingDrawing" xmlns:wp="http://schemas.openxmlformats.org/drawingml/2006/wordprocessingDrawing" xmlns:w10="urn:schemas-microsoft-com:office:word" xmlns:w="http://schemas.openxmlformats.org/wordprocessingml/2006/main" xmlns:w14="http://schemas.microsoft.com/office/word/2010/wordml" xmlns:w15="http://schemas.microsoft.com/office/word/2012/wordml" xmlns:w16cex="http://schemas.microsoft.com/office/word/2018/wordml/cex" xmlns:w16cid="http://schemas.microsoft.com/office/word/2016/wordml/cid" xmlns:w16="http://schemas.microsoft.com/office/word/2018/wordml" xmlns:w16du="http://schemas.microsoft.com/office/word/2023/wordml/word16du" xmlns:w16sdtdh="http://schemas.microsoft.com/office/word/2020/wordml/sdtdatahash" xmlns:w16sdtfl="http://schemas.microsoft.com/office/word/2024/wordml/sdtformatlock" xmlns:w16se="http://schemas.microsoft.com/office/word/2015/wordml/symex" xmlns:wpg="http://schemas.microsoft.com/office/word/2010/wordprocessingGroup" xmlns:wpi="http://schemas.microsoft.com/office/word/2010/wordprocessingInk" xmlns:wne="http://schemas.microsoft.com/office/word/2006/wordml" xmlns:wps="http://schemas.microsoft.com/office/word/2010/wordprocessingShape" mc:Ignorable="w14 w15 w16se w16cid w16 w16cex w16sdtdh w16sdtfl w16du wp14">
   <w:p>
     <w:pPr>
-      <w:pStyle w:val="utrang"/>
+      <w:pStyle w:val="Header"/>
     </w:pPr>
   </w:p>
 </w:hdr>
@@ -2946,7 +2759,7 @@
 <w:hdr xmlns:wpc="http://schemas.microsoft.com/office/word/2010/wordprocessingCanvas" xmlns:cx="http://schemas.microsoft.com/office/drawing/2014/chartex" xmlns:cx1="http://schemas.microsoft.com/office/drawing/2015/9/8/chartex" xmlns:cx2="http://schemas.microsoft.com/office/drawing/2015/10/21/chartex" xmlns:cx3="http://schemas.microsoft.com/office/drawing/2016/5/9/chartex" xmlns:cx4="http://schemas.microsoft.com/office/drawing/2016/5/10/chartex" xmlns:cx5="http://schemas.microsoft.com/office/drawing/2016/5/11/chartex" xmlns:cx6="http://schemas.microsoft.com/office/drawing/2016/5/12/chartex" xmlns:cx7="http://schemas.microsoft.com/office/drawing/2016/5/13/chartex" xmlns:cx8="http://schemas.microsoft.com/office/drawing/2016/5/14/chartex" xmlns:mc="http://schemas.openxmlformats.org/markup-compatibility/2006" xmlns:aink="http://schemas.microsoft.com/office/drawing/2016/ink" xmlns:am3d="http://schemas.microsoft.com/office/drawing/2017/model3d" xmlns:o="urn:schemas-microsoft-com:office:office" xmlns:oel="http://schemas.microsoft.com/office/2019/extlst" xmlns:r="http://schemas.openxmlformats.org/officeDocument/2006/relationships" xmlns:m="http://schemas.openxmlformats.org/officeDocument/2006/math" xmlns:v="urn:schemas-microsoft-com:vml" xmlns:wp14="http://schemas.microsoft.com/office/word/2010/wordprocessingDrawing" xmlns:wp="http://schemas.openxmlformats.org/drawingml/2006/wordprocessingDrawing" xmlns:w10="urn:schemas-microsoft-com:office:word" xmlns:w="http://schemas.openxmlformats.org/wordprocessingml/2006/main" xmlns:w14="http://schemas.microsoft.com/office/word/2010/wordml" xmlns:w15="http://schemas.microsoft.com/office/word/2012/wordml" xmlns:w16cex="http://schemas.microsoft.com/office/word/2018/wordml/cex" xmlns:w16cid="http://schemas.microsoft.com/office/word/2016/wordml/cid" xmlns:w16="http://schemas.microsoft.com/office/word/2018/wordml" xmlns:w16du="http://schemas.microsoft.com/office/word/2023/wordml/word16du" xmlns:w16sdtdh="http://schemas.microsoft.com/office/word/2020/wordml/sdtdatahash" xmlns:w16sdtfl="http://schemas.microsoft.com/office/word/2024/wordml/sdtformatlock" xmlns:w16se="http://schemas.microsoft.com/office/word/2015/wordml/symex" xmlns:wpg="http://schemas.microsoft.com/office/word/2010/wordprocessingGroup" xmlns:wpi="http://schemas.microsoft.com/office/word/2010/wordprocessingInk" xmlns:wne="http://schemas.microsoft.com/office/word/2006/wordml" xmlns:wps="http://schemas.microsoft.com/office/word/2010/wordprocessingShape" mc:Ignorable="w14 w15 w16se w16cid w16 w16cex w16sdtdh w16sdtfl w16du wp14">
   <w:p>
     <w:pPr>
-      <w:pStyle w:val="utrang"/>
+      <w:pStyle w:val="Header"/>
     </w:pPr>
   </w:p>
 </w:hdr>
@@ -5099,15 +4912,6 @@
   </w:num>
   <w:num w:numId="16" w16cid:durableId="124323845">
     <w:abstractNumId w:val="7"/>
-    <w:lvlOverride w:ilvl="0"/>
-    <w:lvlOverride w:ilvl="1"/>
-    <w:lvlOverride w:ilvl="2"/>
-    <w:lvlOverride w:ilvl="3"/>
-    <w:lvlOverride w:ilvl="4"/>
-    <w:lvlOverride w:ilvl="5"/>
-    <w:lvlOverride w:ilvl="6"/>
-    <w:lvlOverride w:ilvl="7"/>
-    <w:lvlOverride w:ilvl="8"/>
   </w:num>
   <w:num w:numId="17" w16cid:durableId="1522233050">
     <w:abstractNumId w:val="17"/>
@@ -5149,6 +4953,50 @@
     <w:lsdException w:name="Subtitle" w:qFormat="1"/>
     <w:lsdException w:name="Strong" w:qFormat="1"/>
     <w:lsdException w:name="Emphasis" w:qFormat="1"/>
+    <w:lsdException w:name="Normal Table" w:semiHidden="1" w:unhideWhenUsed="1"/>
+    <w:lsdException w:name="Table Simple 1" w:semiHidden="1" w:unhideWhenUsed="1"/>
+    <w:lsdException w:name="Table Simple 2" w:semiHidden="1" w:unhideWhenUsed="1"/>
+    <w:lsdException w:name="Table Simple 3" w:semiHidden="1" w:unhideWhenUsed="1"/>
+    <w:lsdException w:name="Table Classic 1" w:semiHidden="1" w:unhideWhenUsed="1"/>
+    <w:lsdException w:name="Table Classic 2" w:semiHidden="1" w:unhideWhenUsed="1"/>
+    <w:lsdException w:name="Table Classic 3" w:semiHidden="1" w:unhideWhenUsed="1"/>
+    <w:lsdException w:name="Table Classic 4" w:semiHidden="1" w:unhideWhenUsed="1"/>
+    <w:lsdException w:name="Table Colorful 1" w:semiHidden="1" w:unhideWhenUsed="1"/>
+    <w:lsdException w:name="Table Colorful 2" w:semiHidden="1" w:unhideWhenUsed="1"/>
+    <w:lsdException w:name="Table Colorful 3" w:semiHidden="1" w:unhideWhenUsed="1"/>
+    <w:lsdException w:name="Table Columns 1" w:semiHidden="1" w:unhideWhenUsed="1"/>
+    <w:lsdException w:name="Table Columns 2" w:semiHidden="1" w:unhideWhenUsed="1"/>
+    <w:lsdException w:name="Table Columns 3" w:semiHidden="1" w:unhideWhenUsed="1"/>
+    <w:lsdException w:name="Table Columns 4" w:semiHidden="1" w:unhideWhenUsed="1"/>
+    <w:lsdException w:name="Table Columns 5" w:semiHidden="1" w:unhideWhenUsed="1"/>
+    <w:lsdException w:name="Table Grid 1" w:semiHidden="1" w:unhideWhenUsed="1"/>
+    <w:lsdException w:name="Table Grid 2" w:semiHidden="1" w:unhideWhenUsed="1"/>
+    <w:lsdException w:name="Table Grid 3" w:semiHidden="1" w:unhideWhenUsed="1"/>
+    <w:lsdException w:name="Table Grid 4" w:semiHidden="1" w:unhideWhenUsed="1"/>
+    <w:lsdException w:name="Table Grid 5" w:semiHidden="1" w:unhideWhenUsed="1"/>
+    <w:lsdException w:name="Table Grid 6" w:semiHidden="1" w:unhideWhenUsed="1"/>
+    <w:lsdException w:name="Table Grid 7" w:semiHidden="1" w:unhideWhenUsed="1"/>
+    <w:lsdException w:name="Table Grid 8" w:semiHidden="1" w:unhideWhenUsed="1"/>
+    <w:lsdException w:name="Table List 1" w:semiHidden="1" w:unhideWhenUsed="1"/>
+    <w:lsdException w:name="Table List 2" w:semiHidden="1" w:unhideWhenUsed="1"/>
+    <w:lsdException w:name="Table List 3" w:semiHidden="1" w:unhideWhenUsed="1"/>
+    <w:lsdException w:name="Table List 4" w:semiHidden="1" w:unhideWhenUsed="1"/>
+    <w:lsdException w:name="Table List 5" w:semiHidden="1" w:unhideWhenUsed="1"/>
+    <w:lsdException w:name="Table List 6" w:semiHidden="1" w:unhideWhenUsed="1"/>
+    <w:lsdException w:name="Table List 7" w:semiHidden="1" w:unhideWhenUsed="1"/>
+    <w:lsdException w:name="Table List 8" w:semiHidden="1" w:unhideWhenUsed="1"/>
+    <w:lsdException w:name="Table 3D effects 1" w:semiHidden="1" w:unhideWhenUsed="1"/>
+    <w:lsdException w:name="Table 3D effects 2" w:semiHidden="1" w:unhideWhenUsed="1"/>
+    <w:lsdException w:name="Table 3D effects 3" w:semiHidden="1" w:unhideWhenUsed="1"/>
+    <w:lsdException w:name="Table Contemporary" w:semiHidden="1" w:unhideWhenUsed="1"/>
+    <w:lsdException w:name="Table Elegant" w:semiHidden="1" w:unhideWhenUsed="1"/>
+    <w:lsdException w:name="Table Professional" w:semiHidden="1" w:unhideWhenUsed="1"/>
+    <w:lsdException w:name="Table Subtle 1" w:semiHidden="1" w:unhideWhenUsed="1"/>
+    <w:lsdException w:name="Table Subtle 2" w:semiHidden="1" w:unhideWhenUsed="1"/>
+    <w:lsdException w:name="Table Web 1" w:semiHidden="1" w:unhideWhenUsed="1"/>
+    <w:lsdException w:name="Table Web 2" w:semiHidden="1" w:unhideWhenUsed="1"/>
+    <w:lsdException w:name="Table Web 3" w:semiHidden="1" w:unhideWhenUsed="1"/>
+    <w:lsdException w:name="Table Theme" w:semiHidden="1" w:unhideWhenUsed="1"/>
     <w:lsdException w:name="Placeholder Text" w:semiHidden="1" w:uiPriority="99"/>
     <w:lsdException w:name="No Spacing" w:uiPriority="1" w:qFormat="1"/>
     <w:lsdException w:name="Light Shading" w:uiPriority="60"/>
@@ -5370,7 +5218,7 @@
     <w:lsdException w:name="Unresolved Mention" w:semiHidden="1" w:uiPriority="99" w:unhideWhenUsed="1"/>
     <w:lsdException w:name="Smart Link" w:semiHidden="1" w:uiPriority="99" w:unhideWhenUsed="1"/>
   </w:latentStyles>
-  <w:style w:type="paragraph" w:default="1" w:styleId="Binhthng">
+  <w:style w:type="paragraph" w:default="1" w:styleId="Normal">
     <w:name w:val="Normal"/>
     <w:qFormat/>
     <w:rsid w:val="008870A8"/>
@@ -5380,11 +5228,11 @@
       <w:lang w:val="en-US" w:eastAsia="en-US"/>
     </w:rPr>
   </w:style>
-  <w:style w:type="paragraph" w:styleId="u1">
+  <w:style w:type="paragraph" w:styleId="Heading1">
     <w:name w:val="heading 1"/>
-    <w:basedOn w:val="Binhthng"/>
-    <w:next w:val="Binhthng"/>
-    <w:link w:val="u1Char"/>
+    <w:basedOn w:val="Normal"/>
+    <w:next w:val="Normal"/>
+    <w:link w:val="Heading1Char"/>
     <w:qFormat/>
     <w:rsid w:val="006A1C34"/>
     <w:pPr>
@@ -5401,10 +5249,10 @@
       <w:szCs w:val="32"/>
     </w:rPr>
   </w:style>
-  <w:style w:type="paragraph" w:styleId="u3">
+  <w:style w:type="paragraph" w:styleId="Heading3">
     <w:name w:val="heading 3"/>
-    <w:basedOn w:val="Binhthng"/>
-    <w:next w:val="Binhthng"/>
+    <w:basedOn w:val="Normal"/>
+    <w:next w:val="Normal"/>
     <w:qFormat/>
     <w:rsid w:val="002A23B5"/>
     <w:pPr>
@@ -5422,17 +5270,17 @@
       <w:lang w:eastAsia="ar-SA"/>
     </w:rPr>
   </w:style>
-  <w:style w:type="character" w:default="1" w:styleId="Phngmcinhcuaoanvn">
+  <w:style w:type="character" w:default="1" w:styleId="DefaultParagraphFont">
     <w:name w:val="Default Paragraph Font"/>
     <w:uiPriority w:val="1"/>
+    <w:semiHidden/>
     <w:unhideWhenUsed/>
   </w:style>
-  <w:style w:type="table" w:default="1" w:styleId="BangThngthng">
+  <w:style w:type="table" w:default="1" w:styleId="TableNormal">
     <w:name w:val="Normal Table"/>
     <w:uiPriority w:val="99"/>
     <w:semiHidden/>
     <w:unhideWhenUsed/>
-    <w:qFormat/>
     <w:tblPr>
       <w:tblInd w:w="0" w:type="dxa"/>
       <w:tblCellMar>
@@ -5443,16 +5291,16 @@
       </w:tblCellMar>
     </w:tblPr>
   </w:style>
-  <w:style w:type="numbering" w:default="1" w:styleId="Khngco">
+  <w:style w:type="numbering" w:default="1" w:styleId="NoList">
     <w:name w:val="No List"/>
     <w:uiPriority w:val="99"/>
     <w:semiHidden/>
     <w:unhideWhenUsed/>
   </w:style>
-  <w:style w:type="paragraph" w:styleId="Chntrang">
+  <w:style w:type="paragraph" w:styleId="Footer">
     <w:name w:val="footer"/>
-    <w:basedOn w:val="Binhthng"/>
-    <w:link w:val="ChntrangChar"/>
+    <w:basedOn w:val="Normal"/>
+    <w:link w:val="FooterChar"/>
     <w:uiPriority w:val="99"/>
     <w:rsid w:val="00D00977"/>
     <w:pPr>
@@ -5462,14 +5310,14 @@
       </w:tabs>
     </w:pPr>
   </w:style>
-  <w:style w:type="character" w:styleId="Strang">
+  <w:style w:type="character" w:styleId="PageNumber">
     <w:name w:val="page number"/>
-    <w:basedOn w:val="Phngmcinhcuaoanvn"/>
+    <w:basedOn w:val="DefaultParagraphFont"/>
     <w:rsid w:val="00D00977"/>
   </w:style>
-  <w:style w:type="paragraph" w:styleId="Bongchuthich">
+  <w:style w:type="paragraph" w:styleId="BalloonText">
     <w:name w:val="Balloon Text"/>
-    <w:basedOn w:val="Binhthng"/>
+    <w:basedOn w:val="Normal"/>
     <w:semiHidden/>
     <w:rsid w:val="00CF4DBC"/>
     <w:rPr>
@@ -5478,9 +5326,9 @@
       <w:szCs w:val="16"/>
     </w:rPr>
   </w:style>
-  <w:style w:type="paragraph" w:styleId="utrang">
+  <w:style w:type="paragraph" w:styleId="Header">
     <w:name w:val="header"/>
-    <w:basedOn w:val="Binhthng"/>
+    <w:basedOn w:val="Normal"/>
     <w:rsid w:val="0028585D"/>
     <w:pPr>
       <w:tabs>
@@ -5489,7 +5337,7 @@
       </w:tabs>
     </w:pPr>
   </w:style>
-  <w:style w:type="character" w:styleId="Siuktni">
+  <w:style w:type="character" w:styleId="Hyperlink">
     <w:name w:val="Hyperlink"/>
     <w:rsid w:val="00263BED"/>
     <w:rPr>
@@ -5497,11 +5345,11 @@
       <w:u w:val="single"/>
     </w:rPr>
   </w:style>
-  <w:style w:type="paragraph" w:styleId="oancuaDanhsach">
+  <w:style w:type="paragraph" w:styleId="ListParagraph">
     <w:name w:val="List Paragraph"/>
     <w:aliases w:val="VNA - List Paragraph,lp1,List Paragraph1,lp11,List Paragraph 1,My checklist,bullet 1,Bullet L1,Colorful List - Accent 11,List Paragraph11,bullet,Bullet List,FooterText,Paragraphe de liste,List Paragraph2"/>
-    <w:basedOn w:val="Binhthng"/>
-    <w:link w:val="oancuaDanhsachChar"/>
+    <w:basedOn w:val="Normal"/>
+    <w:link w:val="ListParagraphChar"/>
     <w:qFormat/>
     <w:rsid w:val="000C03C2"/>
     <w:pPr>
@@ -5509,9 +5357,9 @@
       <w:contextualSpacing/>
     </w:pPr>
   </w:style>
-  <w:style w:type="table" w:styleId="LiBang">
+  <w:style w:type="table" w:styleId="TableGrid">
     <w:name w:val="Table Grid"/>
-    <w:basedOn w:val="BangThngthng"/>
+    <w:basedOn w:val="TableNormal"/>
     <w:rsid w:val="00726EA2"/>
     <w:tblPr>
       <w:tblBorders>
@@ -5524,9 +5372,9 @@
       </w:tblBorders>
     </w:tblPr>
   </w:style>
-  <w:style w:type="paragraph" w:styleId="Thnvnban2">
+  <w:style w:type="paragraph" w:styleId="BodyText2">
     <w:name w:val="Body Text 2"/>
-    <w:basedOn w:val="Binhthng"/>
+    <w:basedOn w:val="Normal"/>
     <w:rsid w:val="00C27573"/>
     <w:pPr>
       <w:jc w:val="both"/>
@@ -5538,7 +5386,7 @@
   </w:style>
   <w:style w:type="paragraph" w:customStyle="1" w:styleId="Char">
     <w:name w:val="Char"/>
-    <w:basedOn w:val="Binhthng"/>
+    <w:basedOn w:val="Normal"/>
     <w:autoRedefine/>
     <w:rsid w:val="000A477B"/>
     <w:pPr>
@@ -5551,9 +5399,9 @@
       <w:szCs w:val="26"/>
     </w:rPr>
   </w:style>
-  <w:style w:type="paragraph" w:styleId="KhngDncch">
+  <w:style w:type="paragraph" w:styleId="NoSpacing">
     <w:name w:val="No Spacing"/>
-    <w:link w:val="KhngDncchChar"/>
+    <w:link w:val="NoSpacingChar"/>
     <w:uiPriority w:val="1"/>
     <w:qFormat/>
     <w:rsid w:val="00591CC9"/>
@@ -5564,9 +5412,9 @@
       <w:lang w:val="en-US" w:eastAsia="en-US"/>
     </w:rPr>
   </w:style>
-  <w:style w:type="character" w:customStyle="1" w:styleId="KhngDncchChar">
-    <w:name w:val="Không Dãn cách Char"/>
-    <w:link w:val="KhngDncch"/>
+  <w:style w:type="character" w:customStyle="1" w:styleId="NoSpacingChar">
+    <w:name w:val="No Spacing Char"/>
+    <w:link w:val="NoSpacing"/>
     <w:uiPriority w:val="1"/>
     <w:rsid w:val="00591CC9"/>
     <w:rPr>
@@ -5576,7 +5424,7 @@
       <w:lang w:val="en-US" w:eastAsia="en-US" w:bidi="ar-SA"/>
     </w:rPr>
   </w:style>
-  <w:style w:type="character" w:styleId="Nhnmanh">
+  <w:style w:type="character" w:styleId="Emphasis">
     <w:name w:val="Emphasis"/>
     <w:qFormat/>
     <w:rsid w:val="008257DF"/>
@@ -5585,10 +5433,10 @@
       <w:iCs/>
     </w:rPr>
   </w:style>
-  <w:style w:type="character" w:customStyle="1" w:styleId="oancuaDanhsachChar">
-    <w:name w:val="Đoạn của Danh sách Char"/>
-    <w:aliases w:val="VNA - List Paragraph Char,lp1 Char,List Paragraph1 Char,lp11 Char,List Paragraph 1 Char,My checklist Char,bullet 1 Char,Bullet L1 Char,Colorful List - Accent 11 Char,List Paragraph11 Char,bullet Char,Bullet List Char"/>
-    <w:link w:val="oancuaDanhsach"/>
+  <w:style w:type="character" w:customStyle="1" w:styleId="ListParagraphChar">
+    <w:name w:val="List Paragraph Char"/>
+    <w:aliases w:val="VNA - List Paragraph Char,lp1 Char,List Paragraph1 Char,lp11 Char,List Paragraph 1 Char,My checklist Char,bullet 1 Char,Bullet L1 Char,Colorful List - Accent 11 Char,List Paragraph11 Char,bullet Char,Bullet List Char,FooterText Char"/>
+    <w:link w:val="ListParagraph"/>
     <w:uiPriority w:val="34"/>
     <w:locked/>
     <w:rsid w:val="000D6C8F"/>
@@ -5598,9 +5446,9 @@
       <w:lang w:val="en-US" w:eastAsia="en-US"/>
     </w:rPr>
   </w:style>
-  <w:style w:type="character" w:customStyle="1" w:styleId="u1Char">
-    <w:name w:val="Đầu đề 1 Char"/>
-    <w:link w:val="u1"/>
+  <w:style w:type="character" w:customStyle="1" w:styleId="Heading1Char">
+    <w:name w:val="Heading 1 Char"/>
+    <w:link w:val="Heading1"/>
     <w:rsid w:val="006A1C34"/>
     <w:rPr>
       <w:rFonts w:ascii="Cambria" w:eastAsia="Times New Roman" w:hAnsi="Cambria" w:cs="Times New Roman"/>
@@ -5611,9 +5459,9 @@
       <w:szCs w:val="32"/>
     </w:rPr>
   </w:style>
-  <w:style w:type="character" w:customStyle="1" w:styleId="ChntrangChar">
-    <w:name w:val="Chân trang Char"/>
-    <w:link w:val="Chntrang"/>
+  <w:style w:type="character" w:customStyle="1" w:styleId="FooterChar">
+    <w:name w:val="Footer Char"/>
+    <w:link w:val="Footer"/>
     <w:uiPriority w:val="99"/>
     <w:rsid w:val="00DA57B5"/>
     <w:rPr>

</xml_diff>